<commit_message>
Fix: PV-urile de apa (CD) la faze determinante aratau "PRIMARIA COMUNEI STRAJA" in loc de santierul real
In sablonul pv-cd.docx, randul "...emisa de PRIMARIA COMUNEI STRAJA..."
de la cele 2 PV-uri de "faze determinante" avea numele comunei scris
fix in text, ramas probabil dintr-un sablon sursa diferit - in loc sa
foloseasca {locatie} ca in restul documentului (si ca in pv-cm.docx /
pv-cr.docx, care aveau deja corect {locatie} in acelasi loc). Rezultat:
orice PV de apa la faze determinante arata "Straja" indiferent de
santierul real (ex. Stauceni).

Inlocuit STRAJA cu {locatie}, validat (XSD, numar paragrafe neschimbat)
si verificat cu testul real end-to-end ca randul arata acum corect
"PRIMARIA COMUNEI Stăuceni". Suita completa de 11 teste automate trece.

Co-Authored-By: Claude Sonnet 5 <noreply@anthropic.com>
Claude-Session: https://claude.ai/code/session_01Mkvo6VocG8QA8cfRjqLs3H
</commit_message>
<xml_diff>
--- a/ing-assistant/templates/pv-cd.docx
+++ b/ing-assistant/templates/pv-cd.docx
@@ -3320,7 +3320,7 @@
           <w:szCs w:val="20"/>
           <w:lang w:val="it-IT"/>
         </w:rPr>
-        <w:t xml:space="preserve"> emisa de PRIMARIA COMUNEI STRAJA se executa in baza proiectului </w:t>
+        <w:t xml:space="preserve"> emisa de PRIMARIA COMUNEI {locatie} se executa in baza proiectului </w:t>
       </w:r>
       <w:r>
         <w:rPr>
@@ -6987,7 +6987,7 @@
           <w:szCs w:val="20"/>
           <w:lang w:val="it-IT"/>
         </w:rPr>
-        <w:t xml:space="preserve"> emisa de PRIMARIA COMUNEI STRAJA se executa in baza proiectului </w:t>
+        <w:t xml:space="preserve"> emisa de PRIMARIA COMUNEI {locatie} se executa in baza proiectului </w:t>
       </w:r>
       <w:r>
         <w:rPr>

</xml_diff>